<commit_message>
feat: add ZKTeco USB import and terminal profiles
</commit_message>
<xml_diff>
--- a/docs/MANUAL_USO_SRTIME_WEB_WINDOWS.docx
+++ b/docs/MANUAL_USO_SRTIME_WEB_WINDOWS.docx
@@ -1660,12 +1660,7 @@
     <w:p>
       <w:pPr/>
       <w:r>
-        <w:rPr>
-          <w:rFonts w:ascii="Calibri" w:hAnsi="Calibri"/>
-          <w:color w:val="000000"/>
-          <w:sz w:val="22"/>
-        </w:rPr>
-        <w:t>Durante la prueba desde código fuente, el servidor se inicia y detiene manualmente. La instalación como servicio Windows se incorporará al instalador después de la validación QA.</w:t>
+        <w:t>En la instalación Windows, SRTime Web corre como servicio SRTimeWeb. Para pruebas desde código fuente puede iniciarse manualmente, pero la instalación del cliente debe administrarse desde el servicio Windows.</w:t>
       </w:r>
     </w:p>
     <w:p>
@@ -2562,12 +2557,7 @@
         <w:pStyle w:val="ListBullet"/>
       </w:pPr>
       <w:r>
-        <w:rPr>
-          <w:rFonts w:ascii="Calibri" w:hAnsi="Calibri"/>
-          <w:color w:val="000000"/>
-          <w:sz w:val="22"/>
-        </w:rPr>
-        <w:t>El Control Center no detiene el servidor activo. El futuro instalador gestionará el servicio Windows de forma separada.</w:t>
+        <w:t>El Control Center no detiene el servidor activo. El servicio Windows se administra desde PowerShell o Servicios de Windows como SRTimeWeb.</w:t>
       </w:r>
     </w:p>
     <w:p>
@@ -2710,7 +2700,15 @@
         <w:pStyle w:val="ListNumber"/>
       </w:pPr>
       <w:r>
-        <w:t>Aceptar la carpeta propuesta: C:\Service Reloj\SRTime.</w:t>
+        <w:t>Durante el wizard del instalador, seleccionar los drivers de ingesta iniciales: Sundial / TM-MR001, ZKTeco o Sundial + ZKTeco. Ambos drivers quedan instalados; la opción sólo define qué tabs y flujos quedan habilitados inicialmente.</w:t>
+      </w:r>
+    </w:p>
+    <w:p>
+      <w:pPr>
+        <w:pStyle w:val="ListNumber"/>
+      </w:pPr>
+      <w:r>
+        <w:t>Aceptar la carpeta propuesta: C:\Service Reloj\SRTime_web.</w:t>
       </w:r>
     </w:p>
     <w:p>
@@ -2740,7 +2738,7 @@
     <w:p>
       <w:pPr/>
       <w:r>
-        <w:t>El instalador crea config\.env localmente con PostgreSQL 127.0.0.1:5432 y base srtime_db; DB_USER y DB_PASS quedan vacíos y SQLite permanece comentado. Las claves internas se generan de forma única en la PC. En el wizard web ingresar las credenciales PostgreSQL, crear o elegir la base autorizada y crear la cuenta inicial admin.</w:t>
+        <w:t>El instalador crea config\.env localmente con PostgreSQL 127.0.0.1:5432 y base srtime_db; DB_USER y DB_PASS quedan vacíos y SQLite permanece comentado. Las claves internas se generan de forma única en la PC. En el wizard web ingresar las credenciales PostgreSQL, crear o elegir la base autorizada y crear la cuenta inicial admin. La selección de drivers queda en SRTIME_ENABLED_ADDONS y puede cambiarse luego editando config\.env y reiniciando SRTimeWeb.</w:t>
       </w:r>
     </w:p>
     <w:p>
@@ -2761,6 +2759,54 @@
       <w:pPr/>
       <w:r>
         <w:t>Para reiniciar el sistema, abrir PowerShell como administrador y ejecutar Restart-Service SRTimeWeb. Las actualizaciones conservan config\.env, logs y backups.</w:t>
+      </w:r>
+    </w:p>
+    <w:p>
+      <w:pPr>
+        <w:pStyle w:val="Heading1"/>
+      </w:pPr>
+      <w:r>
+        <w:t>14. Notas técnicas del instalador</w:t>
+      </w:r>
+    </w:p>
+    <w:p>
+      <w:pPr>
+        <w:pStyle w:val="ListBullet"/>
+      </w:pPr>
+      <w:r>
+        <w:t>El instalador es onedir empaquetado por Inno Setup; no es onefile. Esto facilita diagnosticar dependencias, servicio, logs y frontend estático.</w:t>
+      </w:r>
+    </w:p>
+    <w:p>
+      <w:pPr>
+        <w:pStyle w:val="ListBullet"/>
+      </w:pPr>
+      <w:r>
+        <w:t>El binario principal es app\srtime-web-api.exe, compilado con Nuitka para la versión Web/PostgreSQL. La versión Windows Desktop con PySide6 se compila por separado con PyInstaller.</w:t>
+      </w:r>
+    </w:p>
+    <w:p>
+      <w:pPr>
+        <w:pStyle w:val="ListBullet"/>
+      </w:pPr>
+      <w:r>
+        <w:t>El servicio se registra como SRTimeWeb mediante WinSW y arranca automáticamente después de reiniciar Windows.</w:t>
+      </w:r>
+    </w:p>
+    <w:p>
+      <w:pPr>
+        <w:pStyle w:val="ListBullet"/>
+      </w:pPr>
+      <w:r>
+        <w:t>El acceso directo local abre http://127.0.0.1:8000. Desde otra PC se usa http://IP_DEL_SERVIDOR:8000.</w:t>
+      </w:r>
+    </w:p>
+    <w:p>
+      <w:pPr>
+        <w:pStyle w:val="ListBullet"/>
+      </w:pPr>
+      <w:r>
+        <w:t>El instalador no incluye credenciales reales ni config\.env con datos sensibles; sólo incluye config\.env.example.</w:t>
       </w:r>
     </w:p>
     <w:sectPr>

</xml_diff>